<commit_message>
Clean up HML pages
</commit_message>
<xml_diff>
--- a/Support guide.docx
+++ b/Support guide.docx
@@ -181,13 +181,7 @@
         <w:rPr>
           <w:lang w:val="en-US"/>
         </w:rPr>
-        <w:t xml:space="preserve"> pushes the changes to GitHub. </w:t>
-      </w:r>
-      <w:r>
-        <w:rPr>
-          <w:lang w:val="en-US"/>
-        </w:rPr>
-        <w:t>Note that there can be a delay of a few minutes before the served pages reflect a push to the repository.</w:t>
+        <w:t xml:space="preserve"> pushes the changes to GitHub. Note that there can be a delay of a few minutes before the served pages reflect a push to the repository.</w:t>
       </w:r>
     </w:p>
     <w:p>
@@ -226,21 +220,7 @@
         <w:rPr>
           <w:lang w:val="en-US"/>
         </w:rPr>
-        <w:t>There is a GitHub ‘</w:t>
-      </w:r>
-      <w:proofErr w:type="spellStart"/>
-      <w:r>
-        <w:rPr>
-          <w:lang w:val="en-US"/>
-        </w:rPr>
-        <w:t>organisation</w:t>
-      </w:r>
-      <w:proofErr w:type="spellEnd"/>
-      <w:r>
-        <w:rPr>
-          <w:lang w:val="en-US"/>
-        </w:rPr>
-        <w:t xml:space="preserve">’ called G1MRA1947 rooted at </w:t>
+        <w:t xml:space="preserve">There is a GitHub ‘organisation’ called G1MRA1947 rooted at </w:t>
       </w:r>
       <w:hyperlink r:id="rId6" w:history="1">
         <w:r>
@@ -367,11 +347,9 @@
         </w:rPr>
         <w:t xml:space="preserve"> as </w:t>
       </w:r>
-      <w:proofErr w:type="spellStart"/>
       <w:r>
         <w:t>rw-donaldp</w:t>
       </w:r>
-      <w:proofErr w:type="spellEnd"/>
       <w:r>
         <w:t xml:space="preserve"> with verified email </w:t>
       </w:r>
@@ -402,19 +380,11 @@
         </w:rPr>
         <w:t xml:space="preserve">G1MRA1947 </w:t>
       </w:r>
-      <w:proofErr w:type="spellStart"/>
-      <w:r>
-        <w:rPr>
-          <w:lang w:val="en-US"/>
-        </w:rPr>
-        <w:t>organisation</w:t>
-      </w:r>
-      <w:proofErr w:type="spellEnd"/>
-      <w:r>
-        <w:rPr>
-          <w:lang w:val="en-US"/>
-        </w:rPr>
-        <w:t xml:space="preserve"> </w:t>
+      <w:r>
+        <w:rPr>
+          <w:lang w:val="en-US"/>
+        </w:rPr>
+        <w:t xml:space="preserve">organisation </w:t>
       </w:r>
       <w:r>
         <w:rPr>
@@ -494,17 +464,8 @@
           <w:b/>
           <w:bCs/>
         </w:rPr>
-        <w:t>.</w:t>
-      </w:r>
-      <w:proofErr w:type="spellStart"/>
-      <w:r>
-        <w:rPr>
-          <w:b/>
-          <w:bCs/>
-        </w:rPr>
-        <w:t>nojekyll</w:t>
-      </w:r>
-      <w:proofErr w:type="spellEnd"/>
+        <w:t>.nojekyll</w:t>
+      </w:r>
       <w:r>
         <w:rPr>
           <w:b/>
@@ -652,27 +613,7 @@
           <w:lang w:eastAsia="en-GB"/>
           <w14:ligatures w14:val="none"/>
         </w:rPr>
-        <w:t>recovery email address</w:t>
-      </w:r>
-      <w:r>
-        <w:rPr>
-          <w:rFonts w:ascii="Calibri" w:eastAsia="Times New Roman" w:hAnsi="Calibri" w:cs="Calibri"/>
-          <w:color w:val="000000"/>
-          <w:kern w:val="0"/>
-          <w:lang w:eastAsia="en-GB"/>
-          <w14:ligatures w14:val="none"/>
-        </w:rPr>
-        <w:t xml:space="preserve"> for this account is</w:t>
-      </w:r>
-      <w:r>
-        <w:rPr>
-          <w:rFonts w:ascii="Calibri" w:eastAsia="Times New Roman" w:hAnsi="Calibri" w:cs="Calibri"/>
-          <w:color w:val="000000"/>
-          <w:kern w:val="0"/>
-          <w:lang w:eastAsia="en-GB"/>
-          <w14:ligatures w14:val="none"/>
-        </w:rPr>
-        <w:t xml:space="preserve"> </w:t>
+        <w:t xml:space="preserve">recovery email address for this account is </w:t>
       </w:r>
       <w:hyperlink r:id="rId12" w:history="1">
         <w:r>
@@ -725,21 +666,7 @@
         <w:rPr>
           <w:lang w:val="en-US"/>
         </w:rPr>
-        <w:t xml:space="preserve">  using the password known to owners of the G1MRA1947 </w:t>
-      </w:r>
-      <w:proofErr w:type="spellStart"/>
-      <w:r>
-        <w:rPr>
-          <w:lang w:val="en-US"/>
-        </w:rPr>
-        <w:t>organisation</w:t>
-      </w:r>
-      <w:proofErr w:type="spellEnd"/>
-      <w:r>
-        <w:rPr>
-          <w:lang w:val="en-US"/>
-        </w:rPr>
-        <w:t xml:space="preserve">. </w:t>
+        <w:t xml:space="preserve">  using the password known to owners of the G1MRA1947 organisation. </w:t>
       </w:r>
     </w:p>
     <w:p>
@@ -993,6 +920,24 @@
           <w:lang w:val="en-US"/>
         </w:rPr>
         <w:t>enquiry</w:t>
+      </w:r>
+    </w:p>
+    <w:p>
+      <w:pPr>
+        <w:pStyle w:val="ListParagraph"/>
+        <w:numPr>
+          <w:ilvl w:val="0"/>
+          <w:numId w:val="5"/>
+        </w:numPr>
+        <w:rPr>
+          <w:lang w:val="en-US"/>
+        </w:rPr>
+      </w:pPr>
+      <w:r>
+        <w:rPr>
+          <w:lang w:val="en-US"/>
+        </w:rPr>
+        <w:t>NLJ order</w:t>
       </w:r>
     </w:p>
     <w:p/>
@@ -2071,6 +2016,7 @@
   <w:style w:type="character" w:default="1" w:styleId="DefaultParagraphFont">
     <w:name w:val="Default Paragraph Font"/>
     <w:uiPriority w:val="1"/>
+    <w:semiHidden/>
     <w:unhideWhenUsed/>
   </w:style>
   <w:style w:type="table" w:default="1" w:styleId="TableNormal">

</xml_diff>

<commit_message>
More text; re-enabled multilingual capability
</commit_message>
<xml_diff>
--- a/Support guide.docx
+++ b/Support guide.docx
@@ -153,7 +153,7 @@
           <w:bCs/>
           <w:lang w:val="en-US"/>
         </w:rPr>
-        <w:t>make</w:t>
+        <w:t>pages</w:t>
       </w:r>
       <w:r>
         <w:rPr>
@@ -220,7 +220,21 @@
         <w:rPr>
           <w:lang w:val="en-US"/>
         </w:rPr>
-        <w:t xml:space="preserve">There is a GitHub ‘organisation’ called G1MRA1947 rooted at </w:t>
+        <w:t>There is a GitHub ‘</w:t>
+      </w:r>
+      <w:proofErr w:type="spellStart"/>
+      <w:r>
+        <w:rPr>
+          <w:lang w:val="en-US"/>
+        </w:rPr>
+        <w:t>organisation</w:t>
+      </w:r>
+      <w:proofErr w:type="spellEnd"/>
+      <w:r>
+        <w:rPr>
+          <w:lang w:val="en-US"/>
+        </w:rPr>
+        <w:t xml:space="preserve">’ called G1MRA1947 rooted at </w:t>
       </w:r>
       <w:hyperlink r:id="rId6" w:history="1">
         <w:r>
@@ -347,9 +361,11 @@
         </w:rPr>
         <w:t xml:space="preserve"> as </w:t>
       </w:r>
+      <w:proofErr w:type="spellStart"/>
       <w:r>
         <w:t>rw-donaldp</w:t>
       </w:r>
+      <w:proofErr w:type="spellEnd"/>
       <w:r>
         <w:t xml:space="preserve"> with verified email </w:t>
       </w:r>
@@ -380,11 +396,19 @@
         </w:rPr>
         <w:t xml:space="preserve">G1MRA1947 </w:t>
       </w:r>
-      <w:r>
-        <w:rPr>
-          <w:lang w:val="en-US"/>
-        </w:rPr>
-        <w:t xml:space="preserve">organisation </w:t>
+      <w:proofErr w:type="spellStart"/>
+      <w:r>
+        <w:rPr>
+          <w:lang w:val="en-US"/>
+        </w:rPr>
+        <w:t>organisation</w:t>
+      </w:r>
+      <w:proofErr w:type="spellEnd"/>
+      <w:r>
+        <w:rPr>
+          <w:lang w:val="en-US"/>
+        </w:rPr>
+        <w:t xml:space="preserve"> </w:t>
       </w:r>
       <w:r>
         <w:rPr>
@@ -464,8 +488,17 @@
           <w:b/>
           <w:bCs/>
         </w:rPr>
-        <w:t>.nojekyll</w:t>
-      </w:r>
+        <w:t>.</w:t>
+      </w:r>
+      <w:proofErr w:type="spellStart"/>
+      <w:r>
+        <w:rPr>
+          <w:b/>
+          <w:bCs/>
+        </w:rPr>
+        <w:t>nojekyll</w:t>
+      </w:r>
+      <w:proofErr w:type="spellEnd"/>
       <w:r>
         <w:rPr>
           <w:b/>
@@ -666,7 +699,21 @@
         <w:rPr>
           <w:lang w:val="en-US"/>
         </w:rPr>
-        <w:t xml:space="preserve">  using the password known to owners of the G1MRA1947 organisation. </w:t>
+        <w:t xml:space="preserve">  using the password known to owners of the G1MRA1947 </w:t>
+      </w:r>
+      <w:proofErr w:type="spellStart"/>
+      <w:r>
+        <w:rPr>
+          <w:lang w:val="en-US"/>
+        </w:rPr>
+        <w:t>organisation</w:t>
+      </w:r>
+      <w:proofErr w:type="spellEnd"/>
+      <w:r>
+        <w:rPr>
+          <w:lang w:val="en-US"/>
+        </w:rPr>
+        <w:t xml:space="preserve">. </w:t>
       </w:r>
     </w:p>
     <w:p>
@@ -697,13 +744,7 @@
         <w:rPr>
           <w:lang w:val="en-US"/>
         </w:rPr>
-        <w:t>New member</w:t>
-      </w:r>
-      <w:r>
-        <w:rPr>
-          <w:lang w:val="en-US"/>
-        </w:rPr>
-        <w:t xml:space="preserve"> application</w:t>
+        <w:t>Book order</w:t>
       </w:r>
     </w:p>
     <w:p>
@@ -721,13 +762,13 @@
         <w:rPr>
           <w:lang w:val="en-US"/>
         </w:rPr>
-        <w:t>Subscription</w:t>
-      </w:r>
-      <w:r>
-        <w:rPr>
-          <w:lang w:val="en-US"/>
-        </w:rPr>
-        <w:t xml:space="preserve"> renewal</w:t>
+        <w:t>Component</w:t>
+      </w:r>
+      <w:r>
+        <w:rPr>
+          <w:lang w:val="en-US"/>
+        </w:rPr>
+        <w:t xml:space="preserve"> order</w:t>
       </w:r>
     </w:p>
     <w:p>
@@ -745,7 +786,7 @@
         <w:rPr>
           <w:lang w:val="en-US"/>
         </w:rPr>
-        <w:t>Book order</w:t>
+        <w:t>General enquiry</w:t>
       </w:r>
     </w:p>
     <w:p>
@@ -763,7 +804,37 @@
         <w:rPr>
           <w:lang w:val="en-US"/>
         </w:rPr>
-        <w:t>Part order</w:t>
+        <w:t xml:space="preserve">Marketplace </w:t>
+      </w:r>
+      <w:r>
+        <w:rPr>
+          <w:lang w:val="en-US"/>
+        </w:rPr>
+        <w:t xml:space="preserve">for </w:t>
+      </w:r>
+      <w:r>
+        <w:rPr>
+          <w:lang w:val="en-US"/>
+        </w:rPr>
+        <w:t>s</w:t>
+      </w:r>
+      <w:r>
+        <w:rPr>
+          <w:lang w:val="en-US"/>
+        </w:rPr>
+        <w:t>a</w:t>
+      </w:r>
+      <w:r>
+        <w:rPr>
+          <w:lang w:val="en-US"/>
+        </w:rPr>
+        <w:t>l</w:t>
+      </w:r>
+      <w:r>
+        <w:rPr>
+          <w:lang w:val="en-US"/>
+        </w:rPr>
+        <w:t>e</w:t>
       </w:r>
     </w:p>
     <w:p>
@@ -781,13 +852,13 @@
         <w:rPr>
           <w:lang w:val="en-US"/>
         </w:rPr>
-        <w:t>Merchandise</w:t>
-      </w:r>
-      <w:r>
-        <w:rPr>
-          <w:lang w:val="en-US"/>
-        </w:rPr>
-        <w:t xml:space="preserve"> order</w:t>
+        <w:t xml:space="preserve">Marketplace </w:t>
+      </w:r>
+      <w:r>
+        <w:rPr>
+          <w:lang w:val="en-US"/>
+        </w:rPr>
+        <w:t>enquiry</w:t>
       </w:r>
     </w:p>
     <w:p>
@@ -805,7 +876,7 @@
         <w:rPr>
           <w:lang w:val="en-US"/>
         </w:rPr>
-        <w:t>Clothing order</w:t>
+        <w:t>Merchandise order</w:t>
       </w:r>
     </w:p>
     <w:p>
@@ -841,37 +912,19 @@
         <w:rPr>
           <w:lang w:val="en-US"/>
         </w:rPr>
-        <w:t xml:space="preserve">Marketplace </w:t>
-      </w:r>
-      <w:r>
-        <w:rPr>
-          <w:lang w:val="en-US"/>
-        </w:rPr>
-        <w:t xml:space="preserve">for </w:t>
-      </w:r>
-      <w:r>
-        <w:rPr>
-          <w:lang w:val="en-US"/>
-        </w:rPr>
-        <w:t>s</w:t>
-      </w:r>
-      <w:r>
-        <w:rPr>
-          <w:lang w:val="en-US"/>
-        </w:rPr>
-        <w:t>a</w:t>
-      </w:r>
-      <w:r>
-        <w:rPr>
-          <w:lang w:val="en-US"/>
-        </w:rPr>
-        <w:t>l</w:t>
-      </w:r>
-      <w:r>
-        <w:rPr>
-          <w:lang w:val="en-US"/>
-        </w:rPr>
-        <w:t>e</w:t>
+        <w:t>N</w:t>
+      </w:r>
+      <w:r>
+        <w:rPr>
+          <w:lang w:val="en-US"/>
+        </w:rPr>
+        <w:t>ewsletter</w:t>
+      </w:r>
+      <w:r>
+        <w:rPr>
+          <w:lang w:val="en-US"/>
+        </w:rPr>
+        <w:t xml:space="preserve"> order</w:t>
       </w:r>
     </w:p>
     <w:p>
@@ -889,13 +942,7 @@
         <w:rPr>
           <w:lang w:val="en-US"/>
         </w:rPr>
-        <w:t xml:space="preserve">Marketplace </w:t>
-      </w:r>
-      <w:r>
-        <w:rPr>
-          <w:lang w:val="en-US"/>
-        </w:rPr>
-        <w:t>enquiry</w:t>
+        <w:t>New member application</w:t>
       </w:r>
     </w:p>
     <w:p>
@@ -913,31 +960,29 @@
         <w:rPr>
           <w:lang w:val="en-US"/>
         </w:rPr>
-        <w:t xml:space="preserve">General </w:t>
-      </w:r>
-      <w:r>
-        <w:rPr>
-          <w:lang w:val="en-US"/>
-        </w:rPr>
-        <w:t>enquiry</w:t>
+        <w:t>Subscription renewal</w:t>
       </w:r>
     </w:p>
     <w:p>
       <w:pPr>
         <w:pStyle w:val="ListParagraph"/>
-        <w:numPr>
-          <w:ilvl w:val="0"/>
-          <w:numId w:val="5"/>
-        </w:numPr>
-        <w:rPr>
-          <w:lang w:val="en-US"/>
-        </w:rPr>
-      </w:pPr>
-      <w:r>
-        <w:rPr>
-          <w:lang w:val="en-US"/>
-        </w:rPr>
-        <w:t>NLJ order</w:t>
+        <w:rPr>
+          <w:lang w:val="en-US"/>
+        </w:rPr>
+      </w:pPr>
+    </w:p>
+    <w:p>
+      <w:pPr>
+        <w:pStyle w:val="Heading3"/>
+        <w:rPr>
+          <w:lang w:val="en-US"/>
+        </w:rPr>
+      </w:pPr>
+      <w:r>
+        <w:rPr>
+          <w:lang w:val="en-US"/>
+        </w:rPr>
+        <w:t>The AMP macro processor</w:t>
       </w:r>
     </w:p>
     <w:p/>

</xml_diff>

<commit_message>
After shift to machine generated translation macro names
</commit_message>
<xml_diff>
--- a/Support guide.docx
+++ b/Support guide.docx
@@ -220,21 +220,7 @@
         <w:rPr>
           <w:lang w:val="en-US"/>
         </w:rPr>
-        <w:t>There is a GitHub ‘</w:t>
-      </w:r>
-      <w:proofErr w:type="spellStart"/>
-      <w:r>
-        <w:rPr>
-          <w:lang w:val="en-US"/>
-        </w:rPr>
-        <w:t>organisation</w:t>
-      </w:r>
-      <w:proofErr w:type="spellEnd"/>
-      <w:r>
-        <w:rPr>
-          <w:lang w:val="en-US"/>
-        </w:rPr>
-        <w:t xml:space="preserve">’ called G1MRA1947 rooted at </w:t>
+        <w:t xml:space="preserve">There is a GitHub ‘organisation’ called G1MRA1947 rooted at </w:t>
       </w:r>
       <w:hyperlink r:id="rId6" w:history="1">
         <w:r>
@@ -361,11 +347,9 @@
         </w:rPr>
         <w:t xml:space="preserve"> as </w:t>
       </w:r>
-      <w:proofErr w:type="spellStart"/>
       <w:r>
         <w:t>rw-donaldp</w:t>
       </w:r>
-      <w:proofErr w:type="spellEnd"/>
       <w:r>
         <w:t xml:space="preserve"> with verified email </w:t>
       </w:r>
@@ -396,19 +380,11 @@
         </w:rPr>
         <w:t xml:space="preserve">G1MRA1947 </w:t>
       </w:r>
-      <w:proofErr w:type="spellStart"/>
-      <w:r>
-        <w:rPr>
-          <w:lang w:val="en-US"/>
-        </w:rPr>
-        <w:t>organisation</w:t>
-      </w:r>
-      <w:proofErr w:type="spellEnd"/>
-      <w:r>
-        <w:rPr>
-          <w:lang w:val="en-US"/>
-        </w:rPr>
-        <w:t xml:space="preserve"> </w:t>
+      <w:r>
+        <w:rPr>
+          <w:lang w:val="en-US"/>
+        </w:rPr>
+        <w:t xml:space="preserve">organisation </w:t>
       </w:r>
       <w:r>
         <w:rPr>
@@ -488,17 +464,8 @@
           <w:b/>
           <w:bCs/>
         </w:rPr>
-        <w:t>.</w:t>
-      </w:r>
-      <w:proofErr w:type="spellStart"/>
-      <w:r>
-        <w:rPr>
-          <w:b/>
-          <w:bCs/>
-        </w:rPr>
-        <w:t>nojekyll</w:t>
-      </w:r>
-      <w:proofErr w:type="spellEnd"/>
+        <w:t>.nojekyll</w:t>
+      </w:r>
       <w:r>
         <w:rPr>
           <w:b/>
@@ -699,21 +666,7 @@
         <w:rPr>
           <w:lang w:val="en-US"/>
         </w:rPr>
-        <w:t xml:space="preserve">  using the password known to owners of the G1MRA1947 </w:t>
-      </w:r>
-      <w:proofErr w:type="spellStart"/>
-      <w:r>
-        <w:rPr>
-          <w:lang w:val="en-US"/>
-        </w:rPr>
-        <w:t>organisation</w:t>
-      </w:r>
-      <w:proofErr w:type="spellEnd"/>
-      <w:r>
-        <w:rPr>
-          <w:lang w:val="en-US"/>
-        </w:rPr>
-        <w:t xml:space="preserve">. </w:t>
+        <w:t xml:space="preserve">  using the password known to owners of the G1MRA1947 organisation. </w:t>
       </w:r>
     </w:p>
     <w:p>

</xml_diff>